<commit_message>
Polish report to match project report rubric
</commit_message>
<xml_diff>
--- a/submission/Project_Report.docx
+++ b/submission/Project_Report.docx
@@ -63,7 +63,7 @@
         <w:jc w:val="center"/>
       </w:pPr>
       <w:r>
-        <w:t>Student number: [complete before submission]</w:t>
+        <w:t>Student number: [enter your student number]</w:t>
       </w:r>
     </w:p>
     <w:p>
@@ -72,7 +72,7 @@
         <w:jc w:val="center"/>
       </w:pPr>
       <w:r>
-        <w:t>Tutor: [complete if required]</w:t>
+        <w:t>Tutor: [enter tutor name if required]</w:t>
       </w:r>
     </w:p>
     <w:p>
@@ -81,7 +81,7 @@
         <w:jc w:val="center"/>
       </w:pPr>
       <w:r>
-        <w:t>Submission date: [complete before submission]</w:t>
+        <w:t>Submission date: 31 October 2026</w:t>
       </w:r>
     </w:p>
     <w:p>
@@ -240,11 +240,60 @@
         <w:spacing w:line="288" w:lineRule="auto" w:after="100"/>
       </w:pPr>
       <w:r>
-        <w:t>Appendix A Reproduction guide</w:t>
+        <w:t>Appendices</w:t>
       </w:r>
       <w:r>
         <w:tab/>
         <w:t>13</w:t>
+      </w:r>
+    </w:p>
+    <w:p>
+      <w:pPr>
+        <w:pStyle w:val="Heading2"/>
+      </w:pPr>
+      <w:r>
+        <w:t>List of Figures and Tables</w:t>
+      </w:r>
+    </w:p>
+    <w:p>
+      <w:r>
+        <w:t>Figure 1. Confusion matrix on the official test set ..................................................... 9</w:t>
+      </w:r>
+    </w:p>
+    <w:p>
+      <w:r>
+        <w:t>Table 1. Project resources and constraints ................................................................ 5</w:t>
+      </w:r>
+    </w:p>
+    <w:p>
+      <w:r>
+        <w:t>Table 2. Test results by training-set size .................................................................... 8</w:t>
+      </w:r>
+    </w:p>
+    <w:p>
+      <w:pPr>
+        <w:pStyle w:val="Heading2"/>
+      </w:pPr>
+      <w:r>
+        <w:t>List of Abbreviations</w:t>
+      </w:r>
+    </w:p>
+    <w:p>
+      <w:r>
+        <w:t>IMDb – Internet Movie Database; NLP – natural language processing; SVM – support vector machine; TF–IDF – term frequency–inverse document frequency; CLI – command-line interface.</w:t>
+      </w:r>
+    </w:p>
+    <w:p>
+      <w:pPr>
+        <w:pStyle w:val="Heading2"/>
+      </w:pPr>
+      <w:r>
+        <w:t>List of Appendices</w:t>
+      </w:r>
+    </w:p>
+    <w:p>
+      <w:r>
+        <w:t>Appendix A. Reproduction guide ................................................................................. 13</w:t>
       </w:r>
     </w:p>
     <w:p>
@@ -336,6 +385,11 @@
     <w:p>
       <w:r>
         <w:t>The scope was kept to one classical supervised approach rather than several unrelated models. A linear SVM is appropriate for sparse, high-dimensional text features and provides a strong, interpretable baseline in terms of a separating margin (Joachims, 1998). TF–IDF downweights terms that occur broadly and gives more influence to terms that are distinctive to documents; bigrams retain some local word-order information. Snowball stemming reduces inflectional variation, while stop-word removal limits common function-word features. Negation terms were explicitly retained because removing them can reverse a sentence’s sentiment. These choices balance performance, runtime, and ease of reproduction.</w:t>
+      </w:r>
+    </w:p>
+    <w:p>
+      <w:r>
+        <w:t>The task brief also cites work comparing classical and deep-learning approaches across text domains (Paramesha et al., 2023). That comparison supports treating model choice as a trade-off rather than assuming that a neural model is automatically preferable. This project selected a linear SVM because it is a well-established sparse-text baseline that can be trained and evaluated with the available resources. A deep model was left as future comparative work; no claim is made here that the SVM is more accurate than deep-learning alternatives.</w:t>
       </w:r>
     </w:p>
     <w:p>
@@ -728,17 +782,18 @@
         <w:tblLook w:firstColumn="1" w:firstRow="1" w:lastColumn="0" w:lastRow="0" w:noHBand="0" w:noVBand="1" w:val="04A0"/>
       </w:tblPr>
       <w:tblGrid>
-        <w:gridCol w:w="1560"/>
-        <w:gridCol w:w="1560"/>
-        <w:gridCol w:w="1560"/>
-        <w:gridCol w:w="1560"/>
-        <w:gridCol w:w="1560"/>
-        <w:gridCol w:w="1560"/>
+        <w:gridCol w:w="1337"/>
+        <w:gridCol w:w="1337"/>
+        <w:gridCol w:w="1337"/>
+        <w:gridCol w:w="1337"/>
+        <w:gridCol w:w="1337"/>
+        <w:gridCol w:w="1337"/>
+        <w:gridCol w:w="1337"/>
       </w:tblGrid>
       <w:tr>
         <w:tc>
           <w:tcPr>
-            <w:tcW w:type="dxa" w:w="1560"/>
+            <w:tcW w:type="dxa" w:w="1337"/>
             <w:shd w:fill="D9E2F3"/>
           </w:tcPr>
           <w:p>
@@ -749,7 +804,7 @@
         </w:tc>
         <w:tc>
           <w:tcPr>
-            <w:tcW w:type="dxa" w:w="1560"/>
+            <w:tcW w:type="dxa" w:w="1337"/>
             <w:shd w:fill="D9E2F3"/>
           </w:tcPr>
           <w:p>
@@ -760,7 +815,7 @@
         </w:tc>
         <w:tc>
           <w:tcPr>
-            <w:tcW w:type="dxa" w:w="1560"/>
+            <w:tcW w:type="dxa" w:w="1337"/>
             <w:shd w:fill="D9E2F3"/>
           </w:tcPr>
           <w:p>
@@ -771,7 +826,7 @@
         </w:tc>
         <w:tc>
           <w:tcPr>
-            <w:tcW w:type="dxa" w:w="1560"/>
+            <w:tcW w:type="dxa" w:w="1337"/>
             <w:shd w:fill="D9E2F3"/>
           </w:tcPr>
           <w:p>
@@ -782,7 +837,7 @@
         </w:tc>
         <w:tc>
           <w:tcPr>
-            <w:tcW w:type="dxa" w:w="1560"/>
+            <w:tcW w:type="dxa" w:w="1337"/>
             <w:shd w:fill="D9E2F3"/>
           </w:tcPr>
           <w:p>
@@ -793,7 +848,7 @@
         </w:tc>
         <w:tc>
           <w:tcPr>
-            <w:tcW w:type="dxa" w:w="1560"/>
+            <w:tcW w:type="dxa" w:w="1337"/>
             <w:shd w:fill="D9E2F3"/>
           </w:tcPr>
           <w:p>
@@ -802,11 +857,22 @@
             </w:r>
           </w:p>
         </w:tc>
+        <w:tc>
+          <w:tcPr>
+            <w:tcW w:type="dxa" w:w="1337"/>
+            <w:shd w:fill="D9E2F3"/>
+          </w:tcPr>
+          <w:p>
+            <w:r>
+              <w:t>Fit (s)</w:t>
+            </w:r>
+          </w:p>
+        </w:tc>
       </w:tr>
       <w:tr>
         <w:tc>
           <w:tcPr>
-            <w:tcW w:type="dxa" w:w="1560"/>
+            <w:tcW w:type="dxa" w:w="1337"/>
           </w:tcPr>
           <w:p>
             <w:r>
@@ -816,7 +882,7 @@
         </w:tc>
         <w:tc>
           <w:tcPr>
-            <w:tcW w:type="dxa" w:w="1560"/>
+            <w:tcW w:type="dxa" w:w="1337"/>
           </w:tcPr>
           <w:p>
             <w:r>
@@ -826,7 +892,7 @@
         </w:tc>
         <w:tc>
           <w:tcPr>
-            <w:tcW w:type="dxa" w:w="1560"/>
+            <w:tcW w:type="dxa" w:w="1337"/>
           </w:tcPr>
           <w:p>
             <w:r>
@@ -836,7 +902,7 @@
         </w:tc>
         <w:tc>
           <w:tcPr>
-            <w:tcW w:type="dxa" w:w="1560"/>
+            <w:tcW w:type="dxa" w:w="1337"/>
           </w:tcPr>
           <w:p>
             <w:r>
@@ -846,7 +912,7 @@
         </w:tc>
         <w:tc>
           <w:tcPr>
-            <w:tcW w:type="dxa" w:w="1560"/>
+            <w:tcW w:type="dxa" w:w="1337"/>
           </w:tcPr>
           <w:p>
             <w:r>
@@ -856,7 +922,7 @@
         </w:tc>
         <w:tc>
           <w:tcPr>
-            <w:tcW w:type="dxa" w:w="1560"/>
+            <w:tcW w:type="dxa" w:w="1337"/>
           </w:tcPr>
           <w:p>
             <w:r>
@@ -864,11 +930,21 @@
             </w:r>
           </w:p>
         </w:tc>
+        <w:tc>
+          <w:tcPr>
+            <w:tcW w:type="dxa" w:w="1337"/>
+          </w:tcPr>
+          <w:p>
+            <w:r>
+              <w:t>0.83</w:t>
+            </w:r>
+          </w:p>
+        </w:tc>
       </w:tr>
       <w:tr>
         <w:tc>
           <w:tcPr>
-            <w:tcW w:type="dxa" w:w="1560"/>
+            <w:tcW w:type="dxa" w:w="1337"/>
           </w:tcPr>
           <w:p>
             <w:r>
@@ -878,7 +954,7 @@
         </w:tc>
         <w:tc>
           <w:tcPr>
-            <w:tcW w:type="dxa" w:w="1560"/>
+            <w:tcW w:type="dxa" w:w="1337"/>
           </w:tcPr>
           <w:p>
             <w:r>
@@ -888,7 +964,7 @@
         </w:tc>
         <w:tc>
           <w:tcPr>
-            <w:tcW w:type="dxa" w:w="1560"/>
+            <w:tcW w:type="dxa" w:w="1337"/>
           </w:tcPr>
           <w:p>
             <w:r>
@@ -898,7 +974,7 @@
         </w:tc>
         <w:tc>
           <w:tcPr>
-            <w:tcW w:type="dxa" w:w="1560"/>
+            <w:tcW w:type="dxa" w:w="1337"/>
           </w:tcPr>
           <w:p>
             <w:r>
@@ -908,7 +984,7 @@
         </w:tc>
         <w:tc>
           <w:tcPr>
-            <w:tcW w:type="dxa" w:w="1560"/>
+            <w:tcW w:type="dxa" w:w="1337"/>
           </w:tcPr>
           <w:p>
             <w:r>
@@ -918,7 +994,7 @@
         </w:tc>
         <w:tc>
           <w:tcPr>
-            <w:tcW w:type="dxa" w:w="1560"/>
+            <w:tcW w:type="dxa" w:w="1337"/>
           </w:tcPr>
           <w:p>
             <w:r>
@@ -926,11 +1002,21 @@
             </w:r>
           </w:p>
         </w:tc>
+        <w:tc>
+          <w:tcPr>
+            <w:tcW w:type="dxa" w:w="1337"/>
+          </w:tcPr>
+          <w:p>
+            <w:r>
+              <w:t>5.24</w:t>
+            </w:r>
+          </w:p>
+        </w:tc>
       </w:tr>
       <w:tr>
         <w:tc>
           <w:tcPr>
-            <w:tcW w:type="dxa" w:w="1560"/>
+            <w:tcW w:type="dxa" w:w="1337"/>
           </w:tcPr>
           <w:p>
             <w:r>
@@ -940,7 +1026,7 @@
         </w:tc>
         <w:tc>
           <w:tcPr>
-            <w:tcW w:type="dxa" w:w="1560"/>
+            <w:tcW w:type="dxa" w:w="1337"/>
           </w:tcPr>
           <w:p>
             <w:r>
@@ -950,7 +1036,7 @@
         </w:tc>
         <w:tc>
           <w:tcPr>
-            <w:tcW w:type="dxa" w:w="1560"/>
+            <w:tcW w:type="dxa" w:w="1337"/>
           </w:tcPr>
           <w:p>
             <w:r>
@@ -960,7 +1046,7 @@
         </w:tc>
         <w:tc>
           <w:tcPr>
-            <w:tcW w:type="dxa" w:w="1560"/>
+            <w:tcW w:type="dxa" w:w="1337"/>
           </w:tcPr>
           <w:p>
             <w:r>
@@ -970,7 +1056,7 @@
         </w:tc>
         <w:tc>
           <w:tcPr>
-            <w:tcW w:type="dxa" w:w="1560"/>
+            <w:tcW w:type="dxa" w:w="1337"/>
           </w:tcPr>
           <w:p>
             <w:r>
@@ -980,11 +1066,21 @@
         </w:tc>
         <w:tc>
           <w:tcPr>
-            <w:tcW w:type="dxa" w:w="1560"/>
+            <w:tcW w:type="dxa" w:w="1337"/>
           </w:tcPr>
           <w:p>
             <w:r>
               <w:t>88.90%</w:t>
+            </w:r>
+          </w:p>
+        </w:tc>
+        <w:tc>
+          <w:tcPr>
+            <w:tcW w:type="dxa" w:w="1337"/>
+          </w:tcPr>
+          <w:p>
+            <w:r>
+              <w:t>20.39</w:t>
             </w:r>
           </w:p>
         </w:tc>
@@ -1160,6 +1256,11 @@
     </w:p>
     <w:p>
       <w:r>
+        <w:t>Paramesha, K., Gururaj, H. L., Nayyar, A., &amp; Ravishankar, K. C. (2023). Sentiment analysis on cross-domain textual data using classical and deep learning approaches. Multimedia Tools and Applications, 1–24.</w:t>
+      </w:r>
+    </w:p>
+    <w:p>
+      <w:r>
         <w:t>NLTK Project. (n.d.). Snowball stemmer. https://www.nltk.org/api/nltk.stem.snowball.html</w:t>
       </w:r>
     </w:p>
@@ -1169,13 +1270,9 @@
       </w:r>
     </w:p>
     <w:p>
-      <w:r>
-        <w:br w:type="page"/>
-      </w:r>
-    </w:p>
-    <w:p>
       <w:pPr>
         <w:pStyle w:val="Heading1"/>
+        <w:pageBreakBefore/>
       </w:pPr>
       <w:r>
         <w:t>Appendix A Reproduction guide</w:t>

</xml_diff>

<commit_message>
Complete report identification details
</commit_message>
<xml_diff>
--- a/submission/Project_Report.docx
+++ b/submission/Project_Report.docx
@@ -63,16 +63,7 @@
         <w:jc w:val="center"/>
       </w:pPr>
       <w:r>
-        <w:t>Student number: [enter your student number]</w:t>
-      </w:r>
-    </w:p>
-    <w:p>
-      <w:pPr>
-        <w:spacing w:line="288" w:lineRule="auto"/>
-        <w:jc w:val="center"/>
-      </w:pPr>
-      <w:r>
-        <w:t>Tutor: [enter tutor name if required]</w:t>
+        <w:t>Matriculation number: 102303212</w:t>
       </w:r>
     </w:p>
     <w:p>
@@ -1236,11 +1227,6 @@
     </w:p>
     <w:p>
       <w:r>
-        <w:t>IU International University of Applied Sciences. (n.d.). Project report: Guidelines for the creation of a project report. Examination Office.</w:t>
-      </w:r>
-    </w:p>
-    <w:p>
-      <w:r>
         <w:t>Jurafsky, D., &amp; Martin, J. H. (2013). Speech and language processing: An introduction to natural language processing, computational linguistics, and speech recognition (2nd ed.). Pearson Prentice Hall.</w:t>
       </w:r>
     </w:p>
@@ -1280,7 +1266,7 @@
     </w:p>
     <w:p>
       <w:r>
-        <w:t>From the `imdb-sentiments` project directory, create and activate a virtual environment, install the packages in `requirements.txt`, and run `python -m src.train`. The first run downloads and validates the public dataset if it is not already present. Default training sizes are 1,000, 5,000, and 25,000. Metrics and the full model are written under `results/`. Run `python -m src.predict "A warm and satisfying film."` to classify a new review. The upstream code repository is https://github.com/MubeenAhmed23/imdb-sentiments. The source tree and locally generated report/results should be committed and pushed before the repository is used as a submission reference.</w:t>
+        <w:t>From the `imdb-sentiments` project directory, create and activate a virtual environment, install the packages in `requirements.txt`, and run `python -m src.train`. The first run downloads and validates the public dataset if it is not already present. Default training sizes are 1,000, 5,000, and 25,000. Metrics and the full model are written under `results/`. Run `python -m src.predict "A warm and satisfying film."` to classify a new review. The source code and generated artifacts are available in the public repository at https://github.com/MubeenAhmed23/imdb-sentiments.</w:t>
       </w:r>
     </w:p>
     <w:p>

</xml_diff>

<commit_message>
Add prominent repository link to report
</commit_message>
<xml_diff>
--- a/submission/Project_Report.docx
+++ b/submission/Project_Report.docx
@@ -754,6 +754,23 @@
     </w:p>
     <w:p>
       <w:pPr>
+        <w:spacing w:line="288" w:lineRule="auto"/>
+      </w:pPr>
+      <w:r>
+        <w:t xml:space="preserve">Project repository: </w:t>
+      </w:r>
+      <w:hyperlink r:id="rId11">
+        <w:r>
+          <w:rPr>
+            <w:color w:val="0563C1"/>
+            <w:u w:val="single"/>
+          </w:rPr>
+          <w:t>github.com/MubeenAhmed23/imdb-sentiments</w:t>
+        </w:r>
+      </w:hyperlink>
+    </w:p>
+    <w:p>
+      <w:pPr>
         <w:pStyle w:val="Heading1"/>
       </w:pPr>
       <w:r>
@@ -1102,7 +1119,7 @@
                     <pic:cNvPicPr/>
                   </pic:nvPicPr>
                   <pic:blipFill>
-                    <a:blip r:embed="rId11"/>
+                    <a:blip r:embed="rId12"/>
                     <a:stretch>
                       <a:fillRect/>
                     </a:stretch>

</xml_diff>

<commit_message>
Add repository link to report title page
</commit_message>
<xml_diff>
--- a/submission/Project_Report.docx
+++ b/submission/Project_Report.docx
@@ -74,6 +74,24 @@
       <w:r>
         <w:t>Submission date: 31 October 2026</w:t>
       </w:r>
+    </w:p>
+    <w:p>
+      <w:pPr>
+        <w:spacing w:before="200"/>
+        <w:jc w:val="center"/>
+      </w:pPr>
+      <w:r>
+        <w:t xml:space="preserve">Project repository: </w:t>
+      </w:r>
+      <w:hyperlink r:id="rId11">
+        <w:r>
+          <w:rPr>
+            <w:color w:val="0563C1"/>
+            <w:u w:val="single"/>
+          </w:rPr>
+          <w:t>github.com/MubeenAhmed23/imdb-sentiments</w:t>
+        </w:r>
+      </w:hyperlink>
     </w:p>
     <w:p>
       <w:r>

</xml_diff>